<commit_message>
Endret tekst. "Pådraget" til "er-verdien"
</commit_message>
<xml_diff>
--- a/04. Simulering/Vannanlegg simulering med matlab.docx
+++ b/04. Simulering/Vannanlegg simulering med matlab.docx
@@ -4,7 +4,7 @@
   <w:body>
     <w:p>
       <w:pPr>
-        <w:pStyle w:val="Heading1"/>
+        <w:pStyle w:val="Overskrift1"/>
         <w:jc w:val="center"/>
         <w:rPr>
           <w:u w:val="single"/>
@@ -443,7 +443,13 @@
         <w:t xml:space="preserve">Figurene viser sammenhengen mellom PI-parameterne i MATLAB-simulering og det fysiske vanntankanlegget. </w:t>
       </w:r>
       <w:r>
-        <w:t xml:space="preserve">Resultat viser litt ulik respons på pådraget, men avvikene er små og reguleringen er tilnærmet lik etter en stund. Dette viser at den teoretisk modell gir et realistisk bilde av systemets oppførsel. </w:t>
+        <w:t xml:space="preserve">Resultat viser litt ulik respons på </w:t>
+      </w:r>
+      <w:r>
+        <w:t>er-verdien</w:t>
+      </w:r>
+      <w:r>
+        <w:t xml:space="preserve">, men avvikene er små og reguleringen er tilnærmet lik etter en stund. Dette viser at den teoretisk modell gir et realistisk bilde av systemets oppførsel. </w:t>
       </w:r>
     </w:p>
     <w:p/>
@@ -986,11 +992,11 @@
     <w:name w:val="Normal"/>
     <w:qFormat/>
   </w:style>
-  <w:style w:type="paragraph" w:styleId="Heading1">
+  <w:style w:type="paragraph" w:styleId="Overskrift1">
     <w:name w:val="heading 1"/>
     <w:basedOn w:val="Normal"/>
     <w:next w:val="Normal"/>
-    <w:link w:val="Heading1Char"/>
+    <w:link w:val="Overskrift1Tegn"/>
     <w:uiPriority w:val="9"/>
     <w:qFormat/>
     <w:rsid w:val="00956CA8"/>
@@ -1007,11 +1013,11 @@
       <w:szCs w:val="40"/>
     </w:rPr>
   </w:style>
-  <w:style w:type="paragraph" w:styleId="Heading2">
+  <w:style w:type="paragraph" w:styleId="Overskrift2">
     <w:name w:val="heading 2"/>
     <w:basedOn w:val="Normal"/>
     <w:next w:val="Normal"/>
-    <w:link w:val="Heading2Char"/>
+    <w:link w:val="Overskrift2Tegn"/>
     <w:uiPriority w:val="9"/>
     <w:semiHidden/>
     <w:unhideWhenUsed/>
@@ -1030,11 +1036,11 @@
       <w:szCs w:val="32"/>
     </w:rPr>
   </w:style>
-  <w:style w:type="paragraph" w:styleId="Heading3">
+  <w:style w:type="paragraph" w:styleId="Overskrift3">
     <w:name w:val="heading 3"/>
     <w:basedOn w:val="Normal"/>
     <w:next w:val="Normal"/>
-    <w:link w:val="Heading3Char"/>
+    <w:link w:val="Overskrift3Tegn"/>
     <w:uiPriority w:val="9"/>
     <w:semiHidden/>
     <w:unhideWhenUsed/>
@@ -1053,11 +1059,11 @@
       <w:szCs w:val="28"/>
     </w:rPr>
   </w:style>
-  <w:style w:type="paragraph" w:styleId="Heading4">
+  <w:style w:type="paragraph" w:styleId="Overskrift4">
     <w:name w:val="heading 4"/>
     <w:basedOn w:val="Normal"/>
     <w:next w:val="Normal"/>
-    <w:link w:val="Heading4Char"/>
+    <w:link w:val="Overskrift4Tegn"/>
     <w:uiPriority w:val="9"/>
     <w:semiHidden/>
     <w:unhideWhenUsed/>
@@ -1076,11 +1082,11 @@
       <w:color w:val="2F5496" w:themeColor="accent1" w:themeShade="BF"/>
     </w:rPr>
   </w:style>
-  <w:style w:type="paragraph" w:styleId="Heading5">
+  <w:style w:type="paragraph" w:styleId="Overskrift5">
     <w:name w:val="heading 5"/>
     <w:basedOn w:val="Normal"/>
     <w:next w:val="Normal"/>
-    <w:link w:val="Heading5Char"/>
+    <w:link w:val="Overskrift5Tegn"/>
     <w:uiPriority w:val="9"/>
     <w:semiHidden/>
     <w:unhideWhenUsed/>
@@ -1097,11 +1103,11 @@
       <w:color w:val="2F5496" w:themeColor="accent1" w:themeShade="BF"/>
     </w:rPr>
   </w:style>
-  <w:style w:type="paragraph" w:styleId="Heading6">
+  <w:style w:type="paragraph" w:styleId="Overskrift6">
     <w:name w:val="heading 6"/>
     <w:basedOn w:val="Normal"/>
     <w:next w:val="Normal"/>
-    <w:link w:val="Heading6Char"/>
+    <w:link w:val="Overskrift6Tegn"/>
     <w:uiPriority w:val="9"/>
     <w:semiHidden/>
     <w:unhideWhenUsed/>
@@ -1120,11 +1126,11 @@
       <w:color w:val="595959" w:themeColor="text1" w:themeTint="A6"/>
     </w:rPr>
   </w:style>
-  <w:style w:type="paragraph" w:styleId="Heading7">
+  <w:style w:type="paragraph" w:styleId="Overskrift7">
     <w:name w:val="heading 7"/>
     <w:basedOn w:val="Normal"/>
     <w:next w:val="Normal"/>
-    <w:link w:val="Heading7Char"/>
+    <w:link w:val="Overskrift7Tegn"/>
     <w:uiPriority w:val="9"/>
     <w:semiHidden/>
     <w:unhideWhenUsed/>
@@ -1141,11 +1147,11 @@
       <w:color w:val="595959" w:themeColor="text1" w:themeTint="A6"/>
     </w:rPr>
   </w:style>
-  <w:style w:type="paragraph" w:styleId="Heading8">
+  <w:style w:type="paragraph" w:styleId="Overskrift8">
     <w:name w:val="heading 8"/>
     <w:basedOn w:val="Normal"/>
     <w:next w:val="Normal"/>
-    <w:link w:val="Heading8Char"/>
+    <w:link w:val="Overskrift8Tegn"/>
     <w:uiPriority w:val="9"/>
     <w:semiHidden/>
     <w:unhideWhenUsed/>
@@ -1164,11 +1170,11 @@
       <w:color w:val="272727" w:themeColor="text1" w:themeTint="D8"/>
     </w:rPr>
   </w:style>
-  <w:style w:type="paragraph" w:styleId="Heading9">
+  <w:style w:type="paragraph" w:styleId="Overskrift9">
     <w:name w:val="heading 9"/>
     <w:basedOn w:val="Normal"/>
     <w:next w:val="Normal"/>
-    <w:link w:val="Heading9Char"/>
+    <w:link w:val="Overskrift9Tegn"/>
     <w:uiPriority w:val="9"/>
     <w:semiHidden/>
     <w:unhideWhenUsed/>
@@ -1185,13 +1191,13 @@
       <w:color w:val="272727" w:themeColor="text1" w:themeTint="D8"/>
     </w:rPr>
   </w:style>
-  <w:style w:type="character" w:default="1" w:styleId="DefaultParagraphFont">
+  <w:style w:type="character" w:default="1" w:styleId="Standardskriftforavsnitt">
     <w:name w:val="Default Paragraph Font"/>
     <w:uiPriority w:val="1"/>
     <w:semiHidden/>
     <w:unhideWhenUsed/>
   </w:style>
-  <w:style w:type="table" w:default="1" w:styleId="TableNormal">
+  <w:style w:type="table" w:default="1" w:styleId="Vanligtabell">
     <w:name w:val="Normal Table"/>
     <w:uiPriority w:val="99"/>
     <w:semiHidden/>
@@ -1206,16 +1212,16 @@
       </w:tblCellMar>
     </w:tblPr>
   </w:style>
-  <w:style w:type="numbering" w:default="1" w:styleId="NoList">
+  <w:style w:type="numbering" w:default="1" w:styleId="Ingenliste">
     <w:name w:val="No List"/>
     <w:uiPriority w:val="99"/>
     <w:semiHidden/>
     <w:unhideWhenUsed/>
   </w:style>
-  <w:style w:type="character" w:customStyle="1" w:styleId="Heading1Char">
-    <w:name w:val="Heading 1 Char"/>
-    <w:basedOn w:val="DefaultParagraphFont"/>
-    <w:link w:val="Heading1"/>
+  <w:style w:type="character" w:customStyle="1" w:styleId="Overskrift1Tegn">
+    <w:name w:val="Overskrift 1 Tegn"/>
+    <w:basedOn w:val="Standardskriftforavsnitt"/>
+    <w:link w:val="Overskrift1"/>
     <w:uiPriority w:val="9"/>
     <w:rsid w:val="00956CA8"/>
     <w:rPr>
@@ -1225,10 +1231,10 @@
       <w:szCs w:val="40"/>
     </w:rPr>
   </w:style>
-  <w:style w:type="character" w:customStyle="1" w:styleId="Heading2Char">
-    <w:name w:val="Heading 2 Char"/>
-    <w:basedOn w:val="DefaultParagraphFont"/>
-    <w:link w:val="Heading2"/>
+  <w:style w:type="character" w:customStyle="1" w:styleId="Overskrift2Tegn">
+    <w:name w:val="Overskrift 2 Tegn"/>
+    <w:basedOn w:val="Standardskriftforavsnitt"/>
+    <w:link w:val="Overskrift2"/>
     <w:uiPriority w:val="9"/>
     <w:semiHidden/>
     <w:rsid w:val="00956CA8"/>
@@ -1239,10 +1245,10 @@
       <w:szCs w:val="32"/>
     </w:rPr>
   </w:style>
-  <w:style w:type="character" w:customStyle="1" w:styleId="Heading3Char">
-    <w:name w:val="Heading 3 Char"/>
-    <w:basedOn w:val="DefaultParagraphFont"/>
-    <w:link w:val="Heading3"/>
+  <w:style w:type="character" w:customStyle="1" w:styleId="Overskrift3Tegn">
+    <w:name w:val="Overskrift 3 Tegn"/>
+    <w:basedOn w:val="Standardskriftforavsnitt"/>
+    <w:link w:val="Overskrift3"/>
     <w:uiPriority w:val="9"/>
     <w:semiHidden/>
     <w:rsid w:val="00956CA8"/>
@@ -1253,10 +1259,10 @@
       <w:szCs w:val="28"/>
     </w:rPr>
   </w:style>
-  <w:style w:type="character" w:customStyle="1" w:styleId="Heading4Char">
-    <w:name w:val="Heading 4 Char"/>
-    <w:basedOn w:val="DefaultParagraphFont"/>
-    <w:link w:val="Heading4"/>
+  <w:style w:type="character" w:customStyle="1" w:styleId="Overskrift4Tegn">
+    <w:name w:val="Overskrift 4 Tegn"/>
+    <w:basedOn w:val="Standardskriftforavsnitt"/>
+    <w:link w:val="Overskrift4"/>
     <w:uiPriority w:val="9"/>
     <w:semiHidden/>
     <w:rsid w:val="00956CA8"/>
@@ -1267,10 +1273,10 @@
       <w:color w:val="2F5496" w:themeColor="accent1" w:themeShade="BF"/>
     </w:rPr>
   </w:style>
-  <w:style w:type="character" w:customStyle="1" w:styleId="Heading5Char">
-    <w:name w:val="Heading 5 Char"/>
-    <w:basedOn w:val="DefaultParagraphFont"/>
-    <w:link w:val="Heading5"/>
+  <w:style w:type="character" w:customStyle="1" w:styleId="Overskrift5Tegn">
+    <w:name w:val="Overskrift 5 Tegn"/>
+    <w:basedOn w:val="Standardskriftforavsnitt"/>
+    <w:link w:val="Overskrift5"/>
     <w:uiPriority w:val="9"/>
     <w:semiHidden/>
     <w:rsid w:val="00956CA8"/>
@@ -1279,10 +1285,10 @@
       <w:color w:val="2F5496" w:themeColor="accent1" w:themeShade="BF"/>
     </w:rPr>
   </w:style>
-  <w:style w:type="character" w:customStyle="1" w:styleId="Heading6Char">
-    <w:name w:val="Heading 6 Char"/>
-    <w:basedOn w:val="DefaultParagraphFont"/>
-    <w:link w:val="Heading6"/>
+  <w:style w:type="character" w:customStyle="1" w:styleId="Overskrift6Tegn">
+    <w:name w:val="Overskrift 6 Tegn"/>
+    <w:basedOn w:val="Standardskriftforavsnitt"/>
+    <w:link w:val="Overskrift6"/>
     <w:uiPriority w:val="9"/>
     <w:semiHidden/>
     <w:rsid w:val="00956CA8"/>
@@ -1293,10 +1299,10 @@
       <w:color w:val="595959" w:themeColor="text1" w:themeTint="A6"/>
     </w:rPr>
   </w:style>
-  <w:style w:type="character" w:customStyle="1" w:styleId="Heading7Char">
-    <w:name w:val="Heading 7 Char"/>
-    <w:basedOn w:val="DefaultParagraphFont"/>
-    <w:link w:val="Heading7"/>
+  <w:style w:type="character" w:customStyle="1" w:styleId="Overskrift7Tegn">
+    <w:name w:val="Overskrift 7 Tegn"/>
+    <w:basedOn w:val="Standardskriftforavsnitt"/>
+    <w:link w:val="Overskrift7"/>
     <w:uiPriority w:val="9"/>
     <w:semiHidden/>
     <w:rsid w:val="00956CA8"/>
@@ -1305,10 +1311,10 @@
       <w:color w:val="595959" w:themeColor="text1" w:themeTint="A6"/>
     </w:rPr>
   </w:style>
-  <w:style w:type="character" w:customStyle="1" w:styleId="Heading8Char">
-    <w:name w:val="Heading 8 Char"/>
-    <w:basedOn w:val="DefaultParagraphFont"/>
-    <w:link w:val="Heading8"/>
+  <w:style w:type="character" w:customStyle="1" w:styleId="Overskrift8Tegn">
+    <w:name w:val="Overskrift 8 Tegn"/>
+    <w:basedOn w:val="Standardskriftforavsnitt"/>
+    <w:link w:val="Overskrift8"/>
     <w:uiPriority w:val="9"/>
     <w:semiHidden/>
     <w:rsid w:val="00956CA8"/>
@@ -1319,10 +1325,10 @@
       <w:color w:val="272727" w:themeColor="text1" w:themeTint="D8"/>
     </w:rPr>
   </w:style>
-  <w:style w:type="character" w:customStyle="1" w:styleId="Heading9Char">
-    <w:name w:val="Heading 9 Char"/>
-    <w:basedOn w:val="DefaultParagraphFont"/>
-    <w:link w:val="Heading9"/>
+  <w:style w:type="character" w:customStyle="1" w:styleId="Overskrift9Tegn">
+    <w:name w:val="Overskrift 9 Tegn"/>
+    <w:basedOn w:val="Standardskriftforavsnitt"/>
+    <w:link w:val="Overskrift9"/>
     <w:uiPriority w:val="9"/>
     <w:semiHidden/>
     <w:rsid w:val="00956CA8"/>
@@ -1331,11 +1337,11 @@
       <w:color w:val="272727" w:themeColor="text1" w:themeTint="D8"/>
     </w:rPr>
   </w:style>
-  <w:style w:type="paragraph" w:styleId="Title">
+  <w:style w:type="paragraph" w:styleId="Tittel">
     <w:name w:val="Title"/>
     <w:basedOn w:val="Normal"/>
     <w:next w:val="Normal"/>
-    <w:link w:val="TitleChar"/>
+    <w:link w:val="TittelTegn"/>
     <w:uiPriority w:val="10"/>
     <w:qFormat/>
     <w:rsid w:val="00956CA8"/>
@@ -1351,10 +1357,10 @@
       <w:szCs w:val="56"/>
     </w:rPr>
   </w:style>
-  <w:style w:type="character" w:customStyle="1" w:styleId="TitleChar">
-    <w:name w:val="Title Char"/>
-    <w:basedOn w:val="DefaultParagraphFont"/>
-    <w:link w:val="Title"/>
+  <w:style w:type="character" w:customStyle="1" w:styleId="TittelTegn">
+    <w:name w:val="Tittel Tegn"/>
+    <w:basedOn w:val="Standardskriftforavsnitt"/>
+    <w:link w:val="Tittel"/>
     <w:uiPriority w:val="10"/>
     <w:rsid w:val="00956CA8"/>
     <w:rPr>
@@ -1365,11 +1371,11 @@
       <w:szCs w:val="56"/>
     </w:rPr>
   </w:style>
-  <w:style w:type="paragraph" w:styleId="Subtitle">
+  <w:style w:type="paragraph" w:styleId="Undertittel">
     <w:name w:val="Subtitle"/>
     <w:basedOn w:val="Normal"/>
     <w:next w:val="Normal"/>
-    <w:link w:val="SubtitleChar"/>
+    <w:link w:val="UndertittelTegn"/>
     <w:uiPriority w:val="11"/>
     <w:qFormat/>
     <w:rsid w:val="00956CA8"/>
@@ -1386,10 +1392,10 @@
       <w:szCs w:val="28"/>
     </w:rPr>
   </w:style>
-  <w:style w:type="character" w:customStyle="1" w:styleId="SubtitleChar">
-    <w:name w:val="Subtitle Char"/>
-    <w:basedOn w:val="DefaultParagraphFont"/>
-    <w:link w:val="Subtitle"/>
+  <w:style w:type="character" w:customStyle="1" w:styleId="UndertittelTegn">
+    <w:name w:val="Undertittel Tegn"/>
+    <w:basedOn w:val="Standardskriftforavsnitt"/>
+    <w:link w:val="Undertittel"/>
     <w:uiPriority w:val="11"/>
     <w:rsid w:val="00956CA8"/>
     <w:rPr>
@@ -1400,11 +1406,11 @@
       <w:szCs w:val="28"/>
     </w:rPr>
   </w:style>
-  <w:style w:type="paragraph" w:styleId="Quote">
+  <w:style w:type="paragraph" w:styleId="Sitat">
     <w:name w:val="Quote"/>
     <w:basedOn w:val="Normal"/>
     <w:next w:val="Normal"/>
-    <w:link w:val="QuoteChar"/>
+    <w:link w:val="SitatTegn"/>
     <w:uiPriority w:val="29"/>
     <w:qFormat/>
     <w:rsid w:val="00956CA8"/>
@@ -1418,10 +1424,10 @@
       <w:color w:val="404040" w:themeColor="text1" w:themeTint="BF"/>
     </w:rPr>
   </w:style>
-  <w:style w:type="character" w:customStyle="1" w:styleId="QuoteChar">
-    <w:name w:val="Quote Char"/>
-    <w:basedOn w:val="DefaultParagraphFont"/>
-    <w:link w:val="Quote"/>
+  <w:style w:type="character" w:customStyle="1" w:styleId="SitatTegn">
+    <w:name w:val="Sitat Tegn"/>
+    <w:basedOn w:val="Standardskriftforavsnitt"/>
+    <w:link w:val="Sitat"/>
     <w:uiPriority w:val="29"/>
     <w:rsid w:val="00956CA8"/>
     <w:rPr>
@@ -1430,7 +1436,7 @@
       <w:color w:val="404040" w:themeColor="text1" w:themeTint="BF"/>
     </w:rPr>
   </w:style>
-  <w:style w:type="paragraph" w:styleId="ListParagraph">
+  <w:style w:type="paragraph" w:styleId="Listeavsnitt">
     <w:name w:val="List Paragraph"/>
     <w:basedOn w:val="Normal"/>
     <w:uiPriority w:val="34"/>
@@ -1441,9 +1447,9 @@
       <w:contextualSpacing/>
     </w:pPr>
   </w:style>
-  <w:style w:type="character" w:styleId="IntenseEmphasis">
+  <w:style w:type="character" w:styleId="Sterkutheving">
     <w:name w:val="Intense Emphasis"/>
-    <w:basedOn w:val="DefaultParagraphFont"/>
+    <w:basedOn w:val="Standardskriftforavsnitt"/>
     <w:uiPriority w:val="21"/>
     <w:qFormat/>
     <w:rsid w:val="00956CA8"/>
@@ -1453,11 +1459,11 @@
       <w:color w:val="2F5496" w:themeColor="accent1" w:themeShade="BF"/>
     </w:rPr>
   </w:style>
-  <w:style w:type="paragraph" w:styleId="IntenseQuote">
+  <w:style w:type="paragraph" w:styleId="Sterktsitat">
     <w:name w:val="Intense Quote"/>
     <w:basedOn w:val="Normal"/>
     <w:next w:val="Normal"/>
-    <w:link w:val="IntenseQuoteChar"/>
+    <w:link w:val="SterktsitatTegn"/>
     <w:uiPriority w:val="30"/>
     <w:qFormat/>
     <w:rsid w:val="00956CA8"/>
@@ -1476,10 +1482,10 @@
       <w:color w:val="2F5496" w:themeColor="accent1" w:themeShade="BF"/>
     </w:rPr>
   </w:style>
-  <w:style w:type="character" w:customStyle="1" w:styleId="IntenseQuoteChar">
-    <w:name w:val="Intense Quote Char"/>
-    <w:basedOn w:val="DefaultParagraphFont"/>
-    <w:link w:val="IntenseQuote"/>
+  <w:style w:type="character" w:customStyle="1" w:styleId="SterktsitatTegn">
+    <w:name w:val="Sterkt sitat Tegn"/>
+    <w:basedOn w:val="Standardskriftforavsnitt"/>
+    <w:link w:val="Sterktsitat"/>
     <w:uiPriority w:val="30"/>
     <w:rsid w:val="00956CA8"/>
     <w:rPr>
@@ -1488,9 +1494,9 @@
       <w:color w:val="2F5496" w:themeColor="accent1" w:themeShade="BF"/>
     </w:rPr>
   </w:style>
-  <w:style w:type="character" w:styleId="IntenseReference">
+  <w:style w:type="character" w:styleId="Sterkreferanse">
     <w:name w:val="Intense Reference"/>
-    <w:basedOn w:val="DefaultParagraphFont"/>
+    <w:basedOn w:val="Standardskriftforavsnitt"/>
     <w:uiPriority w:val="32"/>
     <w:qFormat/>
     <w:rsid w:val="00956CA8"/>
@@ -1798,4 +1804,10 @@
     </a:ext>
   </a:extLst>
 </a:theme>
+</file>
+
+<file path=docMetadata/LabelInfo.xml><?xml version="1.0" encoding="utf-8"?>
+<clbl:labelList xmlns:clbl="http://schemas.microsoft.com/office/2020/mipLabelMetadata">
+  <clbl:label id="{ce632082-0711-4814-a107-d736090bf6b7}" enabled="1" method="Privileged" siteId="{165af75a-d3d2-4282-b6c7-d59148ed006d}" contentBits="0" removed="0"/>
+</clbl:labelList>
 </file>
</xml_diff>